<commit_message>
docs: update TECHSPEC to v1.3 + commit modified Word templates
TECHSPEC changes:
- Bump version to 1.3, date to 14.06.2026
- MAX-based numbering for invoices/acts
- Contract status values: Активний/Призупинено/Завершено/Чернетка
- Path-parameter note for slash-containing contract numbers
- Removed outdated numbering-collision limitation note

Co-Authored-By: Claude Sonnet 4.6 <noreply@anthropic.com>
</commit_message>
<xml_diff>
--- a/_templates/Шаблон_Акт_Доступ_ЄВРО СМАРТ ПАУЕР.docx
+++ b/_templates/Шаблон_Акт_Доступ_ЄВРО СМАРТ ПАУЕР.docx
@@ -269,6 +269,7 @@
       <w:tblPr>
         <w:tblW w:w="9969" w:type="dxa"/>
         <w:tblInd w:w="421" w:type="dxa"/>
+        <w:tblLayout w:type="fixed"/>
         <w:tblCellMar>
           <w:left w:w="15" w:type="dxa"/>
           <w:right w:w="15" w:type="dxa"/>
@@ -276,26 +277,25 @@
         <w:tblLook w:val="0000" w:firstRow="0" w:lastRow="0" w:firstColumn="0" w:lastColumn="0" w:noHBand="0" w:noVBand="0"/>
       </w:tblPr>
       <w:tblGrid>
-        <w:gridCol w:w="521"/>
-        <w:gridCol w:w="3450"/>
-        <w:gridCol w:w="1986"/>
-        <w:gridCol w:w="1520"/>
-        <w:gridCol w:w="1333"/>
-        <w:gridCol w:w="9"/>
-        <w:gridCol w:w="1097"/>
-        <w:gridCol w:w="9"/>
-        <w:gridCol w:w="36"/>
+        <w:gridCol w:w="475"/>
+        <w:gridCol w:w="3352"/>
+        <w:gridCol w:w="2119"/>
+        <w:gridCol w:w="1283"/>
+        <w:gridCol w:w="1289"/>
+        <w:gridCol w:w="1387"/>
+        <w:gridCol w:w="13"/>
+        <w:gridCol w:w="43"/>
         <w:gridCol w:w="8"/>
       </w:tblGrid>
       <w:tr>
         <w:trPr>
           <w:gridAfter w:val="1"/>
-          <w:wAfter w:w="9" w:type="dxa"/>
-          <w:trHeight w:hRule="exact" w:val="277"/>
+          <w:wAfter w:w="8" w:type="dxa"/>
+          <w:trHeight w:hRule="exact" w:val="550"/>
         </w:trPr>
         <w:tc>
           <w:tcPr>
-            <w:tcW w:w="718" w:type="dxa"/>
+            <w:tcW w:w="475" w:type="dxa"/>
             <w:tcBorders>
               <w:top w:val="single" w:sz="4" w:space="0" w:color="000000"/>
               <w:left w:val="single" w:sz="4" w:space="0" w:color="000000"/>
@@ -330,7 +330,7 @@
         </w:tc>
         <w:tc>
           <w:tcPr>
-            <w:tcW w:w="4279" w:type="dxa"/>
+            <w:tcW w:w="3352" w:type="dxa"/>
             <w:tcBorders>
               <w:top w:val="single" w:sz="4" w:space="0" w:color="000000"/>
               <w:left w:val="single" w:sz="4" w:space="0" w:color="000000"/>
@@ -365,7 +365,7 @@
         </w:tc>
         <w:tc>
           <w:tcPr>
-            <w:tcW w:w="1666" w:type="dxa"/>
+            <w:tcW w:w="2119" w:type="dxa"/>
             <w:tcBorders>
               <w:top w:val="single" w:sz="4" w:space="0" w:color="000000"/>
               <w:left w:val="single" w:sz="4" w:space="0" w:color="000000"/>
@@ -418,7 +418,7 @@
         </w:tc>
         <w:tc>
           <w:tcPr>
-            <w:tcW w:w="929" w:type="dxa"/>
+            <w:tcW w:w="1283" w:type="dxa"/>
             <w:tcBorders>
               <w:top w:val="single" w:sz="4" w:space="0" w:color="000000"/>
               <w:left w:val="single" w:sz="4" w:space="0" w:color="000000"/>
@@ -453,7 +453,7 @@
         </w:tc>
         <w:tc>
           <w:tcPr>
-            <w:tcW w:w="1164" w:type="dxa"/>
+            <w:tcW w:w="1289" w:type="dxa"/>
             <w:tcBorders>
               <w:top w:val="single" w:sz="4" w:space="0" w:color="000000"/>
               <w:left w:val="single" w:sz="4" w:space="0" w:color="000000"/>
@@ -488,7 +488,356 @@
         </w:tc>
         <w:tc>
           <w:tcPr>
-            <w:tcW w:w="1156" w:type="dxa"/>
+            <w:tcW w:w="1387" w:type="dxa"/>
+            <w:tcBorders>
+              <w:top w:val="single" w:sz="4" w:space="0" w:color="000000"/>
+              <w:left w:val="single" w:sz="4" w:space="0" w:color="000000"/>
+              <w:bottom w:val="single" w:sz="4" w:space="0" w:color="000000"/>
+              <w:right w:val="single" w:sz="4" w:space="0" w:color="000000"/>
+            </w:tcBorders>
+            <w:shd w:val="clear" w:color="auto" w:fill="FFFFFF"/>
+          </w:tcPr>
+          <w:p>
+            <w:pPr>
+              <w:autoSpaceDE w:val="0"/>
+              <w:autoSpaceDN w:val="0"/>
+              <w:adjustRightInd w:val="0"/>
+              <w:spacing w:line="213" w:lineRule="auto"/>
+              <w:ind w:left="15"/>
+              <w:jc w:val="center"/>
+              <w:rPr>
+                <w:b/>
+                <w:color w:val="000000"/>
+                <w:lang w:val="uk-UA"/>
+              </w:rPr>
+            </w:pPr>
+            <w:r>
+              <w:rPr>
+                <w:b/>
+                <w:color w:val="000000"/>
+                <w:lang w:val="uk-UA"/>
+              </w:rPr>
+              <w:t>Сума, грн.</w:t>
+            </w:r>
+          </w:p>
+        </w:tc>
+        <w:tc>
+          <w:tcPr>
+            <w:tcW w:w="56" w:type="dxa"/>
+            <w:gridSpan w:val="2"/>
+          </w:tcPr>
+          <w:p>
+            <w:pPr>
+              <w:autoSpaceDE w:val="0"/>
+              <w:autoSpaceDN w:val="0"/>
+              <w:adjustRightInd w:val="0"/>
+              <w:spacing w:before="29" w:line="213" w:lineRule="auto"/>
+              <w:ind w:left="15"/>
+              <w:rPr>
+                <w:lang w:val="uk-UA"/>
+              </w:rPr>
+            </w:pPr>
+          </w:p>
+        </w:tc>
+      </w:tr>
+      <w:tr>
+        <w:trPr>
+          <w:gridAfter w:val="1"/>
+          <w:wAfter w:w="8" w:type="dxa"/>
+          <w:trHeight w:hRule="exact" w:val="1179"/>
+        </w:trPr>
+        <w:tc>
+          <w:tcPr>
+            <w:tcW w:w="475" w:type="dxa"/>
+            <w:tcBorders>
+              <w:top w:val="nil"/>
+              <w:left w:val="single" w:sz="4" w:space="0" w:color="000000"/>
+              <w:bottom w:val="single" w:sz="4" w:space="0" w:color="000000"/>
+              <w:right w:val="single" w:sz="4" w:space="0" w:color="000000"/>
+            </w:tcBorders>
+            <w:shd w:val="clear" w:color="auto" w:fill="FFFFFF"/>
+          </w:tcPr>
+          <w:p>
+            <w:pPr>
+              <w:autoSpaceDE w:val="0"/>
+              <w:autoSpaceDN w:val="0"/>
+              <w:adjustRightInd w:val="0"/>
+              <w:spacing w:before="29" w:line="213" w:lineRule="auto"/>
+              <w:ind w:left="15"/>
+              <w:jc w:val="center"/>
+              <w:rPr>
+                <w:color w:val="000000"/>
+                <w:lang w:val="uk-UA"/>
+              </w:rPr>
+            </w:pPr>
+            <w:r>
+              <w:rPr>
+                <w:color w:val="000000"/>
+                <w:lang w:val="uk-UA"/>
+              </w:rPr>
+              <w:t>1</w:t>
+            </w:r>
+          </w:p>
+        </w:tc>
+        <w:tc>
+          <w:tcPr>
+            <w:tcW w:w="3352" w:type="dxa"/>
+            <w:tcBorders>
+              <w:top w:val="nil"/>
+              <w:left w:val="single" w:sz="4" w:space="0" w:color="000000"/>
+              <w:bottom w:val="single" w:sz="4" w:space="0" w:color="000000"/>
+              <w:right w:val="single" w:sz="4" w:space="0" w:color="000000"/>
+            </w:tcBorders>
+            <w:shd w:val="clear" w:color="auto" w:fill="FFFFFF"/>
+          </w:tcPr>
+          <w:p>
+            <w:pPr>
+              <w:autoSpaceDE w:val="0"/>
+              <w:autoSpaceDN w:val="0"/>
+              <w:adjustRightInd w:val="0"/>
+              <w:spacing w:before="29" w:after="240" w:line="213" w:lineRule="auto"/>
+              <w:ind w:left="15"/>
+              <w:rPr>
+                <w:color w:val="000000"/>
+                <w:lang w:val="uk-UA"/>
+              </w:rPr>
+            </w:pPr>
+            <w:r>
+              <w:rPr>
+                <w:rFonts w:ascii="Times New Roman" w:hAnsi="Times New Roman" w:cs="Times New Roman"/>
+                <w:lang w:val="uk-UA"/>
+              </w:rPr>
+              <w:t xml:space="preserve">Доступ до сервісу </w:t>
+            </w:r>
+            <w:proofErr w:type="spellStart"/>
+            <w:r>
+              <w:rPr>
+                <w:rFonts w:ascii="Times New Roman" w:hAnsi="Times New Roman" w:cs="Times New Roman"/>
+                <w:lang w:val="uk-UA"/>
+              </w:rPr>
+              <w:t>DocketPro</w:t>
+            </w:r>
+            <w:proofErr w:type="spellEnd"/>
+            <w:r>
+              <w:rPr>
+                <w:rFonts w:ascii="Times New Roman" w:hAnsi="Times New Roman" w:cs="Times New Roman"/>
+                <w:lang w:val="uk-UA"/>
+              </w:rPr>
+              <w:t xml:space="preserve"> за період з</w:t>
+            </w:r>
+            <w:r>
+              <w:rPr>
+                <w:rFonts w:ascii="Times New Roman" w:hAnsi="Times New Roman" w:cs="Times New Roman"/>
+                <w:lang w:val="uk-UA"/>
+              </w:rPr>
+              <w:t xml:space="preserve"> </w:t>
+            </w:r>
+            <w:r>
+              <w:rPr>
+                <w:lang w:val="uk-UA"/>
+              </w:rPr>
+              <w:t>{{PERIOD_FROM}}-{{PERIOD_TO}}</w:t>
+            </w:r>
+          </w:p>
+        </w:tc>
+        <w:tc>
+          <w:tcPr>
+            <w:tcW w:w="2119" w:type="dxa"/>
+            <w:tcBorders>
+              <w:top w:val="nil"/>
+              <w:left w:val="single" w:sz="4" w:space="0" w:color="000000"/>
+              <w:bottom w:val="single" w:sz="4" w:space="0" w:color="000000"/>
+              <w:right w:val="single" w:sz="4" w:space="0" w:color="000000"/>
+            </w:tcBorders>
+            <w:shd w:val="clear" w:color="auto" w:fill="FFFFFF"/>
+          </w:tcPr>
+          <w:p>
+            <w:pPr>
+              <w:autoSpaceDE w:val="0"/>
+              <w:autoSpaceDN w:val="0"/>
+              <w:adjustRightInd w:val="0"/>
+              <w:spacing w:before="29" w:line="213" w:lineRule="auto"/>
+              <w:ind w:left="15"/>
+              <w:jc w:val="center"/>
+              <w:rPr>
+                <w:color w:val="000000"/>
+                <w:lang w:val="uk-UA"/>
+              </w:rPr>
+            </w:pPr>
+            <w:r>
+              <w:rPr>
+                <w:color w:val="000000"/>
+                <w:lang w:val="uk-UA"/>
+              </w:rPr>
+              <w:t>Користувач/місяць</w:t>
+            </w:r>
+          </w:p>
+        </w:tc>
+        <w:tc>
+          <w:tcPr>
+            <w:tcW w:w="1283" w:type="dxa"/>
+            <w:tcBorders>
+              <w:top w:val="nil"/>
+              <w:left w:val="single" w:sz="4" w:space="0" w:color="000000"/>
+              <w:bottom w:val="single" w:sz="4" w:space="0" w:color="000000"/>
+              <w:right w:val="single" w:sz="4" w:space="0" w:color="000000"/>
+            </w:tcBorders>
+            <w:shd w:val="clear" w:color="auto" w:fill="FFFFFF"/>
+          </w:tcPr>
+          <w:p>
+            <w:pPr>
+              <w:autoSpaceDE w:val="0"/>
+              <w:autoSpaceDN w:val="0"/>
+              <w:adjustRightInd w:val="0"/>
+              <w:spacing w:before="29" w:line="213" w:lineRule="auto"/>
+              <w:ind w:left="15"/>
+              <w:jc w:val="center"/>
+              <w:rPr>
+                <w:color w:val="000000"/>
+                <w:lang w:val="uk-UA"/>
+              </w:rPr>
+            </w:pPr>
+            <w:r>
+              <w:rPr>
+                <w:lang w:val="uk-UA"/>
+              </w:rPr>
+              <w:t>{{USERS}} × {{MONTHS}}</w:t>
+            </w:r>
+          </w:p>
+        </w:tc>
+        <w:tc>
+          <w:tcPr>
+            <w:tcW w:w="1289" w:type="dxa"/>
+            <w:tcBorders>
+              <w:top w:val="nil"/>
+              <w:left w:val="single" w:sz="4" w:space="0" w:color="000000"/>
+              <w:bottom w:val="single" w:sz="4" w:space="0" w:color="000000"/>
+              <w:right w:val="single" w:sz="4" w:space="0" w:color="000000"/>
+            </w:tcBorders>
+            <w:shd w:val="clear" w:color="auto" w:fill="FFFFFF"/>
+          </w:tcPr>
+          <w:p>
+            <w:pPr>
+              <w:autoSpaceDE w:val="0"/>
+              <w:autoSpaceDN w:val="0"/>
+              <w:adjustRightInd w:val="0"/>
+              <w:spacing w:before="29" w:line="213" w:lineRule="auto"/>
+              <w:ind w:left="15"/>
+              <w:jc w:val="right"/>
+              <w:rPr>
+                <w:color w:val="000000"/>
+                <w:lang w:val="uk-UA"/>
+              </w:rPr>
+            </w:pPr>
+            <w:r>
+              <w:rPr>
+                <w:lang w:val="uk-UA"/>
+              </w:rPr>
+              <w:t>{{TARIFF}}</w:t>
+            </w:r>
+          </w:p>
+        </w:tc>
+        <w:tc>
+          <w:tcPr>
+            <w:tcW w:w="1387" w:type="dxa"/>
+            <w:tcBorders>
+              <w:top w:val="nil"/>
+              <w:left w:val="single" w:sz="4" w:space="0" w:color="000000"/>
+              <w:bottom w:val="single" w:sz="4" w:space="0" w:color="000000"/>
+              <w:right w:val="single" w:sz="4" w:space="0" w:color="000000"/>
+            </w:tcBorders>
+            <w:shd w:val="clear" w:color="auto" w:fill="FFFFFF"/>
+          </w:tcPr>
+          <w:p>
+            <w:pPr>
+              <w:autoSpaceDE w:val="0"/>
+              <w:autoSpaceDN w:val="0"/>
+              <w:adjustRightInd w:val="0"/>
+              <w:spacing w:before="29" w:line="213" w:lineRule="auto"/>
+              <w:ind w:left="15"/>
+              <w:jc w:val="right"/>
+              <w:rPr>
+                <w:color w:val="000000"/>
+                <w:lang w:val="uk-UA"/>
+              </w:rPr>
+            </w:pPr>
+            <w:r>
+              <w:rPr>
+                <w:lang w:val="uk-UA"/>
+              </w:rPr>
+              <w:t>{{</w:t>
+            </w:r>
+            <w:r>
+              <w:rPr>
+                <w:b/>
+                <w:bCs/>
+                <w:lang w:val="uk-UA"/>
+              </w:rPr>
+              <w:t>SUM</w:t>
+            </w:r>
+            <w:r>
+              <w:rPr>
+                <w:lang w:val="uk-UA"/>
+              </w:rPr>
+              <w:t>}}</w:t>
+            </w:r>
+          </w:p>
+        </w:tc>
+        <w:tc>
+          <w:tcPr>
+            <w:tcW w:w="56" w:type="dxa"/>
+            <w:gridSpan w:val="2"/>
+          </w:tcPr>
+          <w:p>
+            <w:pPr>
+              <w:autoSpaceDE w:val="0"/>
+              <w:autoSpaceDN w:val="0"/>
+              <w:adjustRightInd w:val="0"/>
+              <w:spacing w:before="29" w:line="213" w:lineRule="auto"/>
+              <w:ind w:left="15"/>
+              <w:rPr>
+                <w:lang w:val="uk-UA"/>
+              </w:rPr>
+            </w:pPr>
+          </w:p>
+        </w:tc>
+      </w:tr>
+      <w:tr>
+        <w:trPr>
+          <w:trHeight w:hRule="exact" w:val="377"/>
+        </w:trPr>
+        <w:tc>
+          <w:tcPr>
+            <w:tcW w:w="8518" w:type="dxa"/>
+            <w:gridSpan w:val="5"/>
+          </w:tcPr>
+          <w:p>
+            <w:pPr>
+              <w:autoSpaceDE w:val="0"/>
+              <w:autoSpaceDN w:val="0"/>
+              <w:adjustRightInd w:val="0"/>
+              <w:spacing w:before="29" w:line="213" w:lineRule="auto"/>
+              <w:ind w:left="15"/>
+              <w:jc w:val="right"/>
+              <w:rPr>
+                <w:b/>
+                <w:color w:val="000000"/>
+                <w:lang w:val="uk-UA"/>
+              </w:rPr>
+            </w:pPr>
+            <w:r>
+              <w:rPr>
+                <w:b/>
+                <w:color w:val="000000"/>
+                <w:lang w:val="uk-UA"/>
+              </w:rPr>
+              <w:t>Разом до сплати</w:t>
+            </w:r>
+          </w:p>
+        </w:tc>
+        <w:tc>
+          <w:tcPr>
+            <w:tcW w:w="1400" w:type="dxa"/>
             <w:gridSpan w:val="2"/>
             <w:tcBorders>
               <w:top w:val="single" w:sz="4" w:space="0" w:color="000000"/>
@@ -503,7 +852,7 @@
               <w:autoSpaceDE w:val="0"/>
               <w:autoSpaceDN w:val="0"/>
               <w:adjustRightInd w:val="0"/>
-              <w:spacing w:line="213" w:lineRule="auto"/>
+              <w:spacing w:before="29" w:line="213" w:lineRule="auto"/>
               <w:ind w:left="15"/>
               <w:jc w:val="center"/>
               <w:rPr>
@@ -514,17 +863,29 @@
             </w:pPr>
             <w:r>
               <w:rPr>
+                <w:lang w:val="uk-UA"/>
+              </w:rPr>
+              <w:t>{{</w:t>
+            </w:r>
+            <w:r>
+              <w:rPr>
                 <w:b/>
-                <w:color w:val="000000"/>
-                <w:lang w:val="uk-UA"/>
-              </w:rPr>
-              <w:t>Сума, грн.</w:t>
+                <w:bCs/>
+                <w:lang w:val="uk-UA"/>
+              </w:rPr>
+              <w:t>SUM</w:t>
+            </w:r>
+            <w:r>
+              <w:rPr>
+                <w:lang w:val="uk-UA"/>
+              </w:rPr>
+              <w:t>}}</w:t>
             </w:r>
           </w:p>
         </w:tc>
         <w:tc>
           <w:tcPr>
-            <w:tcW w:w="48" w:type="dxa"/>
+            <w:tcW w:w="51" w:type="dxa"/>
             <w:gridSpan w:val="2"/>
           </w:tcPr>
           <w:p>
@@ -541,364 +902,16 @@
           </w:p>
         </w:tc>
       </w:tr>
-      <w:tr>
-        <w:trPr>
-          <w:gridAfter w:val="1"/>
-          <w:wAfter w:w="9" w:type="dxa"/>
-          <w:trHeight w:hRule="exact" w:val="1179"/>
-        </w:trPr>
-        <w:tc>
-          <w:tcPr>
-            <w:tcW w:w="718" w:type="dxa"/>
-            <w:tcBorders>
-              <w:top w:val="nil"/>
-              <w:left w:val="single" w:sz="4" w:space="0" w:color="000000"/>
-              <w:bottom w:val="single" w:sz="4" w:space="0" w:color="000000"/>
-              <w:right w:val="single" w:sz="4" w:space="0" w:color="000000"/>
-            </w:tcBorders>
-            <w:shd w:val="clear" w:color="auto" w:fill="FFFFFF"/>
-          </w:tcPr>
-          <w:p>
-            <w:pPr>
-              <w:autoSpaceDE w:val="0"/>
-              <w:autoSpaceDN w:val="0"/>
-              <w:adjustRightInd w:val="0"/>
-              <w:spacing w:before="29" w:line="213" w:lineRule="auto"/>
-              <w:ind w:left="15"/>
-              <w:jc w:val="center"/>
-              <w:rPr>
-                <w:color w:val="000000"/>
-                <w:lang w:val="uk-UA"/>
-              </w:rPr>
-            </w:pPr>
-            <w:r>
-              <w:rPr>
-                <w:color w:val="000000"/>
-                <w:lang w:val="uk-UA"/>
-              </w:rPr>
-              <w:t>1</w:t>
-            </w:r>
-          </w:p>
-        </w:tc>
-        <w:tc>
-          <w:tcPr>
-            <w:tcW w:w="4279" w:type="dxa"/>
-            <w:tcBorders>
-              <w:top w:val="nil"/>
-              <w:left w:val="single" w:sz="4" w:space="0" w:color="000000"/>
-              <w:bottom w:val="single" w:sz="4" w:space="0" w:color="000000"/>
-              <w:right w:val="single" w:sz="4" w:space="0" w:color="000000"/>
-            </w:tcBorders>
-            <w:shd w:val="clear" w:color="auto" w:fill="FFFFFF"/>
-          </w:tcPr>
-          <w:p>
-            <w:pPr>
-              <w:autoSpaceDE w:val="0"/>
-              <w:autoSpaceDN w:val="0"/>
-              <w:adjustRightInd w:val="0"/>
-              <w:spacing w:before="29" w:after="240" w:line="213" w:lineRule="auto"/>
-              <w:ind w:left="15"/>
-              <w:rPr>
-                <w:color w:val="000000"/>
-                <w:lang w:val="uk-UA"/>
-              </w:rPr>
-            </w:pPr>
-            <w:r>
-              <w:rPr>
-                <w:rFonts w:ascii="Times New Roman" w:hAnsi="Times New Roman" w:cs="Times New Roman"/>
-                <w:lang w:val="uk-UA"/>
-              </w:rPr>
-              <w:t xml:space="preserve">Доступ до сервісу </w:t>
-            </w:r>
-            <w:proofErr w:type="spellStart"/>
-            <w:r>
-              <w:rPr>
-                <w:rFonts w:ascii="Times New Roman" w:hAnsi="Times New Roman" w:cs="Times New Roman"/>
-                <w:lang w:val="uk-UA"/>
-              </w:rPr>
-              <w:t>DocketPro</w:t>
-            </w:r>
-            <w:proofErr w:type="spellEnd"/>
-            <w:r>
-              <w:rPr>
-                <w:rFonts w:ascii="Times New Roman" w:hAnsi="Times New Roman" w:cs="Times New Roman"/>
-                <w:lang w:val="uk-UA"/>
-              </w:rPr>
-              <w:t xml:space="preserve"> за період з</w:t>
-            </w:r>
-            <w:r>
-              <w:rPr>
-                <w:lang w:val="uk-UA"/>
-              </w:rPr>
-              <w:t>{{PERIOD_FROM}}-{{PERIOD_TO}}</w:t>
-            </w:r>
-          </w:p>
-        </w:tc>
-        <w:tc>
-          <w:tcPr>
-            <w:tcW w:w="1666" w:type="dxa"/>
-            <w:tcBorders>
-              <w:top w:val="nil"/>
-              <w:left w:val="single" w:sz="4" w:space="0" w:color="000000"/>
-              <w:bottom w:val="single" w:sz="4" w:space="0" w:color="000000"/>
-              <w:right w:val="single" w:sz="4" w:space="0" w:color="000000"/>
-            </w:tcBorders>
-            <w:shd w:val="clear" w:color="auto" w:fill="FFFFFF"/>
-          </w:tcPr>
-          <w:p>
-            <w:pPr>
-              <w:autoSpaceDE w:val="0"/>
-              <w:autoSpaceDN w:val="0"/>
-              <w:adjustRightInd w:val="0"/>
-              <w:spacing w:before="29" w:line="213" w:lineRule="auto"/>
-              <w:ind w:left="15"/>
-              <w:jc w:val="center"/>
-              <w:rPr>
-                <w:color w:val="000000"/>
-                <w:lang w:val="uk-UA"/>
-              </w:rPr>
-            </w:pPr>
-            <w:r>
-              <w:rPr>
-                <w:color w:val="000000"/>
-                <w:lang w:val="uk-UA"/>
-              </w:rPr>
-              <w:t>Користувач/місяць</w:t>
-            </w:r>
-          </w:p>
-        </w:tc>
-        <w:tc>
-          <w:tcPr>
-            <w:tcW w:w="929" w:type="dxa"/>
-            <w:tcBorders>
-              <w:top w:val="nil"/>
-              <w:left w:val="single" w:sz="4" w:space="0" w:color="000000"/>
-              <w:bottom w:val="single" w:sz="4" w:space="0" w:color="000000"/>
-              <w:right w:val="single" w:sz="4" w:space="0" w:color="000000"/>
-            </w:tcBorders>
-            <w:shd w:val="clear" w:color="auto" w:fill="FFFFFF"/>
-          </w:tcPr>
-          <w:p>
-            <w:pPr>
-              <w:autoSpaceDE w:val="0"/>
-              <w:autoSpaceDN w:val="0"/>
-              <w:adjustRightInd w:val="0"/>
-              <w:spacing w:before="29" w:line="213" w:lineRule="auto"/>
-              <w:ind w:left="15"/>
-              <w:jc w:val="center"/>
-              <w:rPr>
-                <w:color w:val="000000"/>
-                <w:lang w:val="uk-UA"/>
-              </w:rPr>
-            </w:pPr>
-            <w:r>
-              <w:rPr>
-                <w:lang w:val="uk-UA"/>
-              </w:rPr>
-              <w:t>{{USERS}} × {{MONTHS}}</w:t>
-            </w:r>
-          </w:p>
-        </w:tc>
-        <w:tc>
-          <w:tcPr>
-            <w:tcW w:w="1164" w:type="dxa"/>
-            <w:tcBorders>
-              <w:top w:val="nil"/>
-              <w:left w:val="single" w:sz="4" w:space="0" w:color="000000"/>
-              <w:bottom w:val="single" w:sz="4" w:space="0" w:color="000000"/>
-              <w:right w:val="single" w:sz="4" w:space="0" w:color="000000"/>
-            </w:tcBorders>
-            <w:shd w:val="clear" w:color="auto" w:fill="FFFFFF"/>
-          </w:tcPr>
-          <w:p>
-            <w:pPr>
-              <w:autoSpaceDE w:val="0"/>
-              <w:autoSpaceDN w:val="0"/>
-              <w:adjustRightInd w:val="0"/>
-              <w:spacing w:before="29" w:line="213" w:lineRule="auto"/>
-              <w:ind w:left="15"/>
-              <w:jc w:val="right"/>
-              <w:rPr>
-                <w:color w:val="000000"/>
-                <w:lang w:val="uk-UA"/>
-              </w:rPr>
-            </w:pPr>
-            <w:r>
-              <w:rPr>
-                <w:lang w:val="uk-UA"/>
-              </w:rPr>
-              <w:t>{{TARIFF}}</w:t>
-            </w:r>
-          </w:p>
-        </w:tc>
-        <w:tc>
-          <w:tcPr>
-            <w:tcW w:w="1156" w:type="dxa"/>
-            <w:gridSpan w:val="2"/>
-            <w:tcBorders>
-              <w:top w:val="nil"/>
-              <w:left w:val="single" w:sz="4" w:space="0" w:color="000000"/>
-              <w:bottom w:val="single" w:sz="4" w:space="0" w:color="000000"/>
-              <w:right w:val="single" w:sz="4" w:space="0" w:color="000000"/>
-            </w:tcBorders>
-            <w:shd w:val="clear" w:color="auto" w:fill="FFFFFF"/>
-          </w:tcPr>
-          <w:p>
-            <w:pPr>
-              <w:autoSpaceDE w:val="0"/>
-              <w:autoSpaceDN w:val="0"/>
-              <w:adjustRightInd w:val="0"/>
-              <w:spacing w:before="29" w:line="213" w:lineRule="auto"/>
-              <w:ind w:left="15"/>
-              <w:jc w:val="right"/>
-              <w:rPr>
-                <w:color w:val="000000"/>
-                <w:lang w:val="uk-UA"/>
-              </w:rPr>
-            </w:pPr>
-            <w:r>
-              <w:rPr>
-                <w:lang w:val="uk-UA"/>
-              </w:rPr>
-              <w:t>{{</w:t>
-            </w:r>
-            <w:r>
-              <w:rPr>
-                <w:b/>
-                <w:bCs/>
-                <w:lang w:val="uk-UA"/>
-              </w:rPr>
-              <w:t>SUM</w:t>
-            </w:r>
-            <w:r>
-              <w:rPr>
-                <w:lang w:val="uk-UA"/>
-              </w:rPr>
-              <w:t>}}</w:t>
-            </w:r>
-          </w:p>
-        </w:tc>
-        <w:tc>
-          <w:tcPr>
-            <w:tcW w:w="48" w:type="dxa"/>
-            <w:gridSpan w:val="2"/>
-          </w:tcPr>
-          <w:p>
-            <w:pPr>
-              <w:autoSpaceDE w:val="0"/>
-              <w:autoSpaceDN w:val="0"/>
-              <w:adjustRightInd w:val="0"/>
-              <w:spacing w:before="29" w:line="213" w:lineRule="auto"/>
-              <w:ind w:left="15"/>
-              <w:rPr>
-                <w:lang w:val="uk-UA"/>
-              </w:rPr>
-            </w:pPr>
-          </w:p>
-        </w:tc>
-      </w:tr>
-      <w:tr>
-        <w:trPr>
-          <w:trHeight w:hRule="exact" w:val="263"/>
-        </w:trPr>
-        <w:tc>
-          <w:tcPr>
-            <w:tcW w:w="8765" w:type="dxa"/>
-            <w:gridSpan w:val="6"/>
-          </w:tcPr>
-          <w:p>
-            <w:pPr>
-              <w:autoSpaceDE w:val="0"/>
-              <w:autoSpaceDN w:val="0"/>
-              <w:adjustRightInd w:val="0"/>
-              <w:spacing w:before="29" w:line="213" w:lineRule="auto"/>
-              <w:ind w:left="15"/>
-              <w:jc w:val="right"/>
-              <w:rPr>
-                <w:b/>
-                <w:color w:val="000000"/>
-                <w:lang w:val="uk-UA"/>
-              </w:rPr>
-            </w:pPr>
-            <w:r>
-              <w:rPr>
-                <w:b/>
-                <w:color w:val="000000"/>
-                <w:lang w:val="uk-UA"/>
-              </w:rPr>
-              <w:t>Разом до сплати</w:t>
-            </w:r>
-          </w:p>
-        </w:tc>
-        <w:tc>
-          <w:tcPr>
-            <w:tcW w:w="1156" w:type="dxa"/>
-            <w:gridSpan w:val="2"/>
-            <w:tcBorders>
-              <w:top w:val="single" w:sz="4" w:space="0" w:color="000000"/>
-              <w:left w:val="single" w:sz="4" w:space="0" w:color="000000"/>
-              <w:bottom w:val="single" w:sz="4" w:space="0" w:color="000000"/>
-              <w:right w:val="single" w:sz="4" w:space="0" w:color="000000"/>
-            </w:tcBorders>
-            <w:shd w:val="clear" w:color="auto" w:fill="FFFFFF"/>
-            <w:vAlign w:val="bottom"/>
-          </w:tcPr>
-          <w:p>
-            <w:pPr>
-              <w:autoSpaceDE w:val="0"/>
-              <w:autoSpaceDN w:val="0"/>
-              <w:adjustRightInd w:val="0"/>
-              <w:spacing w:before="29" w:line="213" w:lineRule="auto"/>
-              <w:ind w:left="15"/>
-              <w:jc w:val="right"/>
-              <w:rPr>
-                <w:b/>
-                <w:color w:val="000000"/>
-                <w:lang w:val="uk-UA"/>
-              </w:rPr>
-            </w:pPr>
-            <w:r>
-              <w:rPr>
-                <w:lang w:val="uk-UA"/>
-              </w:rPr>
-              <w:t>{{</w:t>
-            </w:r>
-            <w:r>
-              <w:rPr>
-                <w:b/>
-                <w:bCs/>
-                <w:lang w:val="uk-UA"/>
-              </w:rPr>
-              <w:t>SUM</w:t>
-            </w:r>
-            <w:r>
-              <w:rPr>
-                <w:lang w:val="uk-UA"/>
-              </w:rPr>
-              <w:t>}}</w:t>
-            </w:r>
-          </w:p>
-        </w:tc>
-        <w:tc>
-          <w:tcPr>
-            <w:tcW w:w="48" w:type="dxa"/>
-            <w:gridSpan w:val="2"/>
-          </w:tcPr>
-          <w:p>
-            <w:pPr>
-              <w:autoSpaceDE w:val="0"/>
-              <w:autoSpaceDN w:val="0"/>
-              <w:adjustRightInd w:val="0"/>
-              <w:spacing w:before="29" w:line="213" w:lineRule="auto"/>
-              <w:ind w:left="15"/>
-              <w:rPr>
-                <w:lang w:val="uk-UA"/>
-              </w:rPr>
-            </w:pPr>
-          </w:p>
-        </w:tc>
-      </w:tr>
     </w:tbl>
+    <w:p>
+      <w:pPr>
+        <w:tabs>
+          <w:tab w:val="left" w:pos="-426"/>
+          <w:tab w:val="left" w:pos="851"/>
+        </w:tabs>
+        <w:jc w:val="both"/>
+      </w:pPr>
+    </w:p>
     <w:p>
       <w:pPr>
         <w:tabs>

</xml_diff>